<commit_message>
add: rlq; fix: caminhos das fotos depois de baxiar os relatórios
</commit_message>
<xml_diff>
--- a/Modelos/definitivos/Modelo - RLQ.docx
+++ b/Modelos/definitivos/Modelo - RLQ.docx
@@ -377,23 +377,15 @@
                 <w:sz w:val="18"/>
                 <w:szCs w:val="18"/>
               </w:rPr>
-              <w:t xml:space="preserve">Procedimento: </w:t>
-            </w:r>
-            <w:r>
-              <w:rPr>
-                <w:color w:val="11437E"/>
-                <w:sz w:val="18"/>
-                <w:szCs w:val="18"/>
-              </w:rPr>
-              <w:t xml:space="preserve">IBT </w:t>
-            </w:r>
-            <w:r>
-              <w:rPr>
-                <w:color w:val="11437E"/>
-                <w:sz w:val="18"/>
-                <w:szCs w:val="18"/>
-              </w:rPr>
-              <w:t>16-23</w:t>
+              <w:t>Sistema:</w:t>
+            </w:r>
+            <w:r>
+              <w:rPr>
+                <w:color w:val="11437E"/>
+                <w:sz w:val="18"/>
+                <w:szCs w:val="18"/>
+              </w:rPr>
+              <w:t xml:space="preserve"> {{system}}</w:t>
             </w:r>
           </w:p>
         </w:tc>
@@ -598,12 +590,12 @@
       </w:tr>
       <w:tr>
         <w:trPr>
-          <w:trHeight w:val="20"/>
+          <w:trHeight w:val="146"/>
         </w:trPr>
         <w:tc>
           <w:tcPr>
-            <w:tcW w:w="10350" w:type="dxa"/>
-            <w:gridSpan w:val="4"/>
+            <w:tcW w:w="7470" w:type="dxa"/>
+            <w:gridSpan w:val="3"/>
           </w:tcPr>
           <w:p>
             <w:pPr>
@@ -652,6 +644,58 @@
                 <w:szCs w:val="18"/>
               </w:rPr>
               <w:t>tags</w:t>
+            </w:r>
+            <w:proofErr w:type="spellEnd"/>
+            <w:r>
+              <w:rPr>
+                <w:color w:val="11437E"/>
+                <w:sz w:val="18"/>
+                <w:szCs w:val="18"/>
+              </w:rPr>
+              <w:t>}}</w:t>
+            </w:r>
+          </w:p>
+        </w:tc>
+        <w:tc>
+          <w:tcPr>
+            <w:tcW w:w="2880" w:type="dxa"/>
+          </w:tcPr>
+          <w:p>
+            <w:pPr>
+              <w:widowControl w:val="0"/>
+              <w:spacing w:line="216" w:lineRule="auto"/>
+              <w:rPr>
+                <w:b/>
+                <w:bCs/>
+                <w:sz w:val="18"/>
+                <w:szCs w:val="18"/>
+              </w:rPr>
+            </w:pPr>
+            <w:r>
+              <w:rPr>
+                <w:b/>
+                <w:bCs/>
+                <w:sz w:val="18"/>
+                <w:szCs w:val="18"/>
+              </w:rPr>
+              <w:t xml:space="preserve">ULQ: </w:t>
+            </w:r>
+            <w:r>
+              <w:rPr>
+                <w:color w:val="11437E"/>
+                <w:sz w:val="18"/>
+                <w:szCs w:val="18"/>
+              </w:rPr>
+              <w:t>{{</w:t>
+            </w:r>
+            <w:proofErr w:type="spellStart"/>
+            <w:r>
+              <w:rPr>
+                <w:color w:val="11437E"/>
+                <w:sz w:val="18"/>
+                <w:szCs w:val="18"/>
+              </w:rPr>
+              <w:t>ulq</w:t>
             </w:r>
             <w:proofErr w:type="spellEnd"/>
             <w:r>
@@ -770,14 +814,39 @@
           <w:p>
             <w:pPr>
               <w:pStyle w:val="SemEspaamento"/>
-              <w:jc w:val="center"/>
-              <w:rPr>
-                <w:sz w:val="18"/>
-                <w:szCs w:val="18"/>
-              </w:rPr>
-            </w:pPr>
-            <w:r>
-              <w:rPr>
+              <w:tabs>
+                <w:tab w:val="left" w:pos="1470"/>
+                <w:tab w:val="center" w:pos="2452"/>
+              </w:tabs>
+              <w:rPr>
+                <w:b/>
+                <w:bCs/>
+                <w:sz w:val="18"/>
+                <w:szCs w:val="18"/>
+              </w:rPr>
+            </w:pPr>
+            <w:r>
+              <w:rPr>
+                <w:b/>
+                <w:bCs/>
+                <w:sz w:val="18"/>
+                <w:szCs w:val="18"/>
+              </w:rPr>
+              <w:tab/>
+            </w:r>
+            <w:r>
+              <w:rPr>
+                <w:b/>
+                <w:bCs/>
+                <w:sz w:val="18"/>
+                <w:szCs w:val="18"/>
+              </w:rPr>
+              <w:tab/>
+            </w:r>
+            <w:r>
+              <w:rPr>
+                <w:b/>
+                <w:bCs/>
                 <w:sz w:val="18"/>
                 <w:szCs w:val="18"/>
               </w:rPr>
@@ -897,8 +966,8 @@
         <w:tblLook w:val="0600" w:firstRow="0" w:lastRow="0" w:firstColumn="0" w:lastColumn="0" w:noHBand="1" w:noVBand="1"/>
       </w:tblPr>
       <w:tblGrid>
-        <w:gridCol w:w="5377"/>
-        <w:gridCol w:w="4973"/>
+        <w:gridCol w:w="5235"/>
+        <w:gridCol w:w="5115"/>
       </w:tblGrid>
       <w:tr>
         <w:trPr>
@@ -946,7 +1015,7 @@
         </w:trPr>
         <w:tc>
           <w:tcPr>
-            <w:tcW w:w="5377" w:type="dxa"/>
+            <w:tcW w:w="5235" w:type="dxa"/>
             <w:shd w:val="clear" w:color="auto" w:fill="E8E8E8"/>
             <w:vAlign w:val="center"/>
           </w:tcPr>
@@ -975,7 +1044,7 @@
         </w:tc>
         <w:tc>
           <w:tcPr>
-            <w:tcW w:w="4973" w:type="dxa"/>
+            <w:tcW w:w="5115" w:type="dxa"/>
             <w:shd w:val="clear" w:color="auto" w:fill="E8E8E8"/>
             <w:vAlign w:val="center"/>
           </w:tcPr>
@@ -1010,7 +1079,7 @@
         </w:trPr>
         <w:tc>
           <w:tcPr>
-            <w:tcW w:w="5377" w:type="dxa"/>
+            <w:tcW w:w="5235" w:type="dxa"/>
             <w:shd w:val="clear" w:color="auto" w:fill="FFFFFF"/>
             <w:vAlign w:val="center"/>
           </w:tcPr>
@@ -1055,7 +1124,7 @@
         </w:tc>
         <w:tc>
           <w:tcPr>
-            <w:tcW w:w="4973" w:type="dxa"/>
+            <w:tcW w:w="5115" w:type="dxa"/>
             <w:vAlign w:val="center"/>
           </w:tcPr>
           <w:p>
@@ -1126,8 +1195,8 @@
         <w:tblLook w:val="0600" w:firstRow="0" w:lastRow="0" w:firstColumn="0" w:lastColumn="0" w:noHBand="1" w:noVBand="1"/>
       </w:tblPr>
       <w:tblGrid>
-        <w:gridCol w:w="5169"/>
-        <w:gridCol w:w="5170"/>
+        <w:gridCol w:w="5236"/>
+        <w:gridCol w:w="5103"/>
       </w:tblGrid>
       <w:tr>
         <w:trPr>
@@ -1138,7 +1207,7 @@
         </w:trPr>
         <w:tc>
           <w:tcPr>
-            <w:tcW w:w="2500" w:type="pct"/>
+            <w:tcW w:w="2532" w:type="pct"/>
             <w:tcBorders>
               <w:top w:val="single" w:sz="8" w:space="0" w:color="000000"/>
               <w:left w:val="single" w:sz="8" w:space="0" w:color="000000"/>
@@ -1174,13 +1243,13 @@
                 <w:sz w:val="18"/>
                 <w:szCs w:val="18"/>
               </w:rPr>
-              <w:t>PRODUTOS UTILIZADOS</w:t>
+              <w:t>ETAPAS DE LIMPEZA</w:t>
             </w:r>
           </w:p>
         </w:tc>
         <w:tc>
           <w:tcPr>
-            <w:tcW w:w="2500" w:type="pct"/>
+            <w:tcW w:w="2468" w:type="pct"/>
             <w:tcBorders>
               <w:top w:val="single" w:sz="8" w:space="0" w:color="000000"/>
               <w:left w:val="single" w:sz="8" w:space="0" w:color="000000"/>
@@ -1210,7 +1279,7 @@
                 <w:sz w:val="18"/>
                 <w:szCs w:val="18"/>
               </w:rPr>
-              <w:t>ETAPAS DE LIMPEZA</w:t>
+              <w:t>PRODUTO QUÍMICO</w:t>
             </w:r>
           </w:p>
         </w:tc>
@@ -1222,7 +1291,7 @@
         </w:trPr>
         <w:tc>
           <w:tcPr>
-            <w:tcW w:w="2500" w:type="pct"/>
+            <w:tcW w:w="2532" w:type="pct"/>
             <w:shd w:val="clear" w:color="auto" w:fill="FFFFFF"/>
             <w:vAlign w:val="center"/>
           </w:tcPr>
@@ -1245,16 +1314,14 @@
               </w:rPr>
               <w:t>{{</w:t>
             </w:r>
-            <w:proofErr w:type="spellStart"/>
-            <w:r>
-              <w:rPr>
-                <w:color w:val="11437E"/>
-                <w:sz w:val="18"/>
-                <w:szCs w:val="18"/>
-              </w:rPr>
-              <w:t>products</w:t>
-            </w:r>
-            <w:proofErr w:type="spellEnd"/>
+            <w:r>
+              <w:rPr>
+                <w:color w:val="11437E"/>
+                <w:sz w:val="18"/>
+                <w:szCs w:val="18"/>
+              </w:rPr>
+              <w:t>steps</w:t>
+            </w:r>
             <w:r>
               <w:rPr>
                 <w:color w:val="11437E"/>
@@ -1267,7 +1334,7 @@
         </w:tc>
         <w:tc>
           <w:tcPr>
-            <w:tcW w:w="2500" w:type="pct"/>
+            <w:tcW w:w="2468" w:type="pct"/>
             <w:shd w:val="clear" w:color="auto" w:fill="FFFFFF"/>
             <w:vAlign w:val="center"/>
           </w:tcPr>
@@ -1288,7 +1355,25 @@
                 <w:sz w:val="18"/>
                 <w:szCs w:val="18"/>
               </w:rPr>
-              <w:t>{{steps}}</w:t>
+              <w:t>{{</w:t>
+            </w:r>
+            <w:proofErr w:type="spellStart"/>
+            <w:r>
+              <w:rPr>
+                <w:color w:val="11437E"/>
+                <w:sz w:val="18"/>
+                <w:szCs w:val="18"/>
+              </w:rPr>
+              <w:t>products</w:t>
+            </w:r>
+            <w:proofErr w:type="spellEnd"/>
+            <w:r>
+              <w:rPr>
+                <w:color w:val="11437E"/>
+                <w:sz w:val="18"/>
+                <w:szCs w:val="18"/>
+              </w:rPr>
+              <w:t>}}</w:t>
             </w:r>
           </w:p>
         </w:tc>
@@ -1346,6 +1431,7 @@
                 <w:color w:val="E8E8E8"/>
                 <w:sz w:val="18"/>
                 <w:szCs w:val="18"/>
+                <w:u w:val="single"/>
               </w:rPr>
             </w:pPr>
             <w:r>
@@ -1624,6 +1710,114 @@
         </w:tc>
       </w:tr>
     </w:tbl>
+    <w:p/>
+    <w:tbl>
+      <w:tblPr>
+        <w:tblStyle w:val="a1"/>
+        <w:tblpPr w:leftFromText="141" w:rightFromText="141" w:vertAnchor="text" w:horzAnchor="margin" w:tblpXSpec="center" w:tblpY="68"/>
+        <w:tblW w:w="10350" w:type="dxa"/>
+        <w:tblInd w:w="0" w:type="dxa"/>
+        <w:tblBorders>
+          <w:top w:val="single" w:sz="8" w:space="0" w:color="000000"/>
+          <w:left w:val="single" w:sz="8" w:space="0" w:color="000000"/>
+          <w:bottom w:val="single" w:sz="8" w:space="0" w:color="000000"/>
+          <w:right w:val="single" w:sz="8" w:space="0" w:color="000000"/>
+          <w:insideH w:val="single" w:sz="8" w:space="0" w:color="000000"/>
+          <w:insideV w:val="single" w:sz="8" w:space="0" w:color="000000"/>
+        </w:tblBorders>
+        <w:tblLayout w:type="fixed"/>
+        <w:tblLook w:val="0600" w:firstRow="0" w:lastRow="0" w:firstColumn="0" w:lastColumn="0" w:noHBand="1" w:noVBand="1"/>
+      </w:tblPr>
+      <w:tblGrid>
+        <w:gridCol w:w="10350"/>
+      </w:tblGrid>
+      <w:tr>
+        <w:trPr>
+          <w:trHeight w:val="308"/>
+          <w:tblHeader/>
+        </w:trPr>
+        <w:tc>
+          <w:tcPr>
+            <w:tcW w:w="10350" w:type="dxa"/>
+            <w:shd w:val="clear" w:color="auto" w:fill="30503E"/>
+            <w:vAlign w:val="center"/>
+          </w:tcPr>
+          <w:p>
+            <w:pPr>
+              <w:widowControl w:val="0"/>
+              <w:spacing w:line="240" w:lineRule="auto"/>
+              <w:jc w:val="center"/>
+              <w:rPr>
+                <w:b/>
+                <w:bCs/>
+                <w:color w:val="E8E8E8"/>
+                <w:sz w:val="18"/>
+                <w:szCs w:val="18"/>
+              </w:rPr>
+            </w:pPr>
+            <w:r>
+              <w:rPr>
+                <w:b/>
+                <w:bCs/>
+                <w:color w:val="E8E8E8"/>
+                <w:sz w:val="18"/>
+                <w:szCs w:val="18"/>
+              </w:rPr>
+              <w:t>OBSERVAÇÕES</w:t>
+            </w:r>
+          </w:p>
+        </w:tc>
+      </w:tr>
+      <w:tr>
+        <w:trPr>
+          <w:cantSplit/>
+          <w:trHeight w:val="735"/>
+        </w:trPr>
+        <w:tc>
+          <w:tcPr>
+            <w:tcW w:w="10350" w:type="dxa"/>
+          </w:tcPr>
+          <w:p>
+            <w:pPr>
+              <w:widowControl w:val="0"/>
+              <w:spacing w:line="240" w:lineRule="auto"/>
+              <w:rPr>
+                <w:color w:val="11437E"/>
+                <w:sz w:val="18"/>
+                <w:szCs w:val="18"/>
+              </w:rPr>
+            </w:pPr>
+            <w:r>
+              <w:rPr>
+                <w:color w:val="11437E"/>
+                <w:sz w:val="18"/>
+                <w:szCs w:val="18"/>
+              </w:rPr>
+              <w:t>{{</w:t>
+            </w:r>
+            <w:proofErr w:type="spellStart"/>
+            <w:r>
+              <w:rPr>
+                <w:color w:val="11437E"/>
+                <w:sz w:val="18"/>
+                <w:szCs w:val="18"/>
+              </w:rPr>
+              <w:t>obs</w:t>
+            </w:r>
+            <w:proofErr w:type="spellEnd"/>
+            <w:r>
+              <w:rPr>
+                <w:color w:val="11437E"/>
+                <w:sz w:val="18"/>
+                <w:szCs w:val="18"/>
+              </w:rPr>
+              <w:t>}}</w:t>
+            </w:r>
+          </w:p>
+        </w:tc>
+      </w:tr>
+    </w:tbl>
+    <w:p/>
     <w:tbl>
       <w:tblPr>
         <w:tblStyle w:val="a4"/>
@@ -1851,112 +2045,6 @@
                 <w:bCs/>
               </w:rPr>
               <w:t xml:space="preserve">Cargo: </w:t>
-            </w:r>
-          </w:p>
-        </w:tc>
-      </w:tr>
-    </w:tbl>
-    <w:tbl>
-      <w:tblPr>
-        <w:tblStyle w:val="a1"/>
-        <w:tblpPr w:leftFromText="141" w:rightFromText="141" w:vertAnchor="text" w:horzAnchor="margin" w:tblpXSpec="center" w:tblpY="-1248"/>
-        <w:tblW w:w="10350" w:type="dxa"/>
-        <w:tblInd w:w="0" w:type="dxa"/>
-        <w:tblBorders>
-          <w:top w:val="single" w:sz="8" w:space="0" w:color="000000"/>
-          <w:left w:val="single" w:sz="8" w:space="0" w:color="000000"/>
-          <w:bottom w:val="single" w:sz="8" w:space="0" w:color="000000"/>
-          <w:right w:val="single" w:sz="8" w:space="0" w:color="000000"/>
-          <w:insideH w:val="single" w:sz="8" w:space="0" w:color="000000"/>
-          <w:insideV w:val="single" w:sz="8" w:space="0" w:color="000000"/>
-        </w:tblBorders>
-        <w:tblLayout w:type="fixed"/>
-        <w:tblLook w:val="0600" w:firstRow="0" w:lastRow="0" w:firstColumn="0" w:lastColumn="0" w:noHBand="1" w:noVBand="1"/>
-      </w:tblPr>
-      <w:tblGrid>
-        <w:gridCol w:w="10350"/>
-      </w:tblGrid>
-      <w:tr>
-        <w:trPr>
-          <w:trHeight w:val="308"/>
-          <w:tblHeader/>
-        </w:trPr>
-        <w:tc>
-          <w:tcPr>
-            <w:tcW w:w="10350" w:type="dxa"/>
-            <w:shd w:val="clear" w:color="auto" w:fill="30503E"/>
-            <w:vAlign w:val="center"/>
-          </w:tcPr>
-          <w:p>
-            <w:pPr>
-              <w:widowControl w:val="0"/>
-              <w:spacing w:line="240" w:lineRule="auto"/>
-              <w:jc w:val="center"/>
-              <w:rPr>
-                <w:b/>
-                <w:bCs/>
-                <w:color w:val="E8E8E8"/>
-                <w:sz w:val="18"/>
-                <w:szCs w:val="18"/>
-              </w:rPr>
-            </w:pPr>
-            <w:r>
-              <w:rPr>
-                <w:b/>
-                <w:bCs/>
-                <w:color w:val="E8E8E8"/>
-                <w:sz w:val="18"/>
-                <w:szCs w:val="18"/>
-              </w:rPr>
-              <w:t>OBSERVAÇÕES</w:t>
-            </w:r>
-          </w:p>
-        </w:tc>
-      </w:tr>
-      <w:tr>
-        <w:trPr>
-          <w:cantSplit/>
-          <w:trHeight w:val="735"/>
-        </w:trPr>
-        <w:tc>
-          <w:tcPr>
-            <w:tcW w:w="10350" w:type="dxa"/>
-          </w:tcPr>
-          <w:p>
-            <w:pPr>
-              <w:widowControl w:val="0"/>
-              <w:spacing w:line="240" w:lineRule="auto"/>
-              <w:rPr>
-                <w:color w:val="11437E"/>
-                <w:sz w:val="18"/>
-                <w:szCs w:val="18"/>
-              </w:rPr>
-            </w:pPr>
-            <w:r>
-              <w:rPr>
-                <w:color w:val="11437E"/>
-                <w:sz w:val="18"/>
-                <w:szCs w:val="18"/>
-              </w:rPr>
-              <w:t>{{</w:t>
-            </w:r>
-            <w:proofErr w:type="spellStart"/>
-            <w:r>
-              <w:rPr>
-                <w:color w:val="11437E"/>
-                <w:sz w:val="18"/>
-                <w:szCs w:val="18"/>
-              </w:rPr>
-              <w:t>obs</w:t>
-            </w:r>
-            <w:proofErr w:type="spellEnd"/>
-            <w:r>
-              <w:rPr>
-                <w:color w:val="11437E"/>
-                <w:sz w:val="18"/>
-                <w:szCs w:val="18"/>
-              </w:rPr>
-              <w:t>}}</w:t>
             </w:r>
           </w:p>
         </w:tc>

</xml_diff>

<commit_message>
add: critérios de aprovação de RLQ e RTP
</commit_message>
<xml_diff>
--- a/Modelos/definitivos/Modelo - RLQ.docx
+++ b/Modelos/definitivos/Modelo - RLQ.docx
@@ -1628,11 +1628,9 @@
             <w:pPr>
               <w:widowControl w:val="0"/>
               <w:rPr>
-                <w:b/>
-                <w:bCs/>
-                <w:color w:val="30503A"/>
-                <w:sz w:val="28"/>
-                <w:szCs w:val="28"/>
+                <w:color w:val="11437E"/>
+                <w:sz w:val="18"/>
+                <w:szCs w:val="18"/>
               </w:rPr>
             </w:pPr>
             <w:r>
@@ -1665,6 +1663,353 @@
         </w:tc>
       </w:tr>
     </w:tbl>
+    <w:p/>
+    <w:tbl>
+      <w:tblPr>
+        <w:tblpPr w:leftFromText="141" w:rightFromText="141" w:vertAnchor="text" w:horzAnchor="margin" w:tblpXSpec="center" w:tblpY="68"/>
+        <w:tblW w:w="10350" w:type="dxa"/>
+        <w:tblBorders>
+          <w:top w:val="single" w:sz="2" w:space="0" w:color="auto"/>
+          <w:left w:val="single" w:sz="2" w:space="0" w:color="auto"/>
+          <w:bottom w:val="single" w:sz="2" w:space="0" w:color="auto"/>
+          <w:right w:val="single" w:sz="2" w:space="0" w:color="auto"/>
+          <w:insideH w:val="single" w:sz="2" w:space="0" w:color="auto"/>
+          <w:insideV w:val="single" w:sz="2" w:space="0" w:color="auto"/>
+        </w:tblBorders>
+        <w:tblLayout w:type="fixed"/>
+        <w:tblLook w:val="0600" w:firstRow="0" w:lastRow="0" w:firstColumn="0" w:lastColumn="0" w:noHBand="1" w:noVBand="1"/>
+      </w:tblPr>
+      <w:tblGrid>
+        <w:gridCol w:w="10350"/>
+      </w:tblGrid>
+      <w:tr>
+        <w:trPr>
+          <w:trHeight w:val="308"/>
+          <w:tblHeader/>
+        </w:trPr>
+        <w:tc>
+          <w:tcPr>
+            <w:tcW w:w="10350" w:type="dxa"/>
+            <w:shd w:val="clear" w:color="auto" w:fill="30503E"/>
+            <w:vAlign w:val="center"/>
+          </w:tcPr>
+          <w:p>
+            <w:pPr>
+              <w:widowControl w:val="0"/>
+              <w:spacing w:line="240" w:lineRule="auto"/>
+              <w:jc w:val="center"/>
+              <w:rPr>
+                <w:b/>
+                <w:bCs/>
+                <w:color w:val="E8E8E8"/>
+                <w:sz w:val="18"/>
+                <w:szCs w:val="18"/>
+              </w:rPr>
+            </w:pPr>
+            <w:r>
+              <w:rPr>
+                <w:b/>
+                <w:bCs/>
+                <w:color w:val="E8E8E8"/>
+                <w:sz w:val="18"/>
+                <w:szCs w:val="18"/>
+              </w:rPr>
+              <w:t>CRITÉRIOS DE ACEITAÇÃO</w:t>
+            </w:r>
+          </w:p>
+        </w:tc>
+      </w:tr>
+      <w:tr>
+        <w:trPr>
+          <w:cantSplit/>
+          <w:trHeight w:val="735"/>
+        </w:trPr>
+        <w:tc>
+          <w:tcPr>
+            <w:tcW w:w="10350" w:type="dxa"/>
+          </w:tcPr>
+          <w:p>
+            <w:pPr>
+              <w:widowControl w:val="0"/>
+              <w:spacing w:line="240" w:lineRule="auto"/>
+              <w:rPr>
+                <w:b/>
+                <w:bCs/>
+                <w:color w:val="000000" w:themeColor="text1"/>
+                <w:sz w:val="20"/>
+                <w:szCs w:val="20"/>
+              </w:rPr>
+            </w:pPr>
+            <w:r>
+              <w:rPr>
+                <w:b/>
+                <w:bCs/>
+                <w:color w:val="000000" w:themeColor="text1"/>
+                <w:sz w:val="20"/>
+                <w:szCs w:val="20"/>
+              </w:rPr>
+              <w:t xml:space="preserve">O </w:t>
+            </w:r>
+            <w:proofErr w:type="spellStart"/>
+            <w:r>
+              <w:rPr>
+                <w:b/>
+                <w:bCs/>
+                <w:color w:val="000000" w:themeColor="text1"/>
+                <w:sz w:val="20"/>
+                <w:szCs w:val="20"/>
+              </w:rPr>
+              <w:t>spool</w:t>
+            </w:r>
+            <w:proofErr w:type="spellEnd"/>
+            <w:r>
+              <w:rPr>
+                <w:b/>
+                <w:bCs/>
+                <w:color w:val="000000" w:themeColor="text1"/>
+                <w:sz w:val="20"/>
+                <w:szCs w:val="20"/>
+              </w:rPr>
+              <w:t xml:space="preserve">/tubulação pode ser aprovado quando: </w:t>
+            </w:r>
+          </w:p>
+          <w:p>
+            <w:pPr>
+              <w:widowControl w:val="0"/>
+              <w:spacing w:line="240" w:lineRule="auto"/>
+              <w:rPr>
+                <w:b/>
+                <w:bCs/>
+                <w:color w:val="000000" w:themeColor="text1"/>
+                <w:sz w:val="20"/>
+                <w:szCs w:val="20"/>
+              </w:rPr>
+            </w:pPr>
+          </w:p>
+          <w:p>
+            <w:pPr>
+              <w:pStyle w:val="PargrafodaLista"/>
+              <w:widowControl w:val="0"/>
+              <w:numPr>
+                <w:ilvl w:val="0"/>
+                <w:numId w:val="1"/>
+              </w:numPr>
+              <w:spacing w:line="240" w:lineRule="auto"/>
+              <w:rPr>
+                <w:color w:val="000000" w:themeColor="text1"/>
+                <w:sz w:val="20"/>
+                <w:szCs w:val="20"/>
+              </w:rPr>
+            </w:pPr>
+            <w:r>
+              <w:rPr>
+                <w:color w:val="000000" w:themeColor="text1"/>
+                <w:sz w:val="20"/>
+                <w:szCs w:val="20"/>
+              </w:rPr>
+              <w:t>A</w:t>
+            </w:r>
+            <w:r>
+              <w:rPr>
+                <w:color w:val="000000" w:themeColor="text1"/>
+                <w:sz w:val="20"/>
+                <w:szCs w:val="20"/>
+              </w:rPr>
+              <w:t xml:space="preserve"> inspeção visual final, com lanterna e/ou vídeo </w:t>
+            </w:r>
+            <w:proofErr w:type="spellStart"/>
+            <w:r>
+              <w:rPr>
+                <w:color w:val="000000" w:themeColor="text1"/>
+                <w:sz w:val="20"/>
+                <w:szCs w:val="20"/>
+              </w:rPr>
+              <w:t>boroscópio</w:t>
+            </w:r>
+            <w:proofErr w:type="spellEnd"/>
+            <w:r>
+              <w:rPr>
+                <w:color w:val="000000" w:themeColor="text1"/>
+                <w:sz w:val="20"/>
+                <w:szCs w:val="20"/>
+              </w:rPr>
+              <w:t xml:space="preserve"> quando necessário, comprovar a eficiência da limpeza;</w:t>
+            </w:r>
+          </w:p>
+          <w:p>
+            <w:pPr>
+              <w:pStyle w:val="PargrafodaLista"/>
+              <w:widowControl w:val="0"/>
+              <w:numPr>
+                <w:ilvl w:val="0"/>
+                <w:numId w:val="1"/>
+              </w:numPr>
+              <w:spacing w:line="240" w:lineRule="auto"/>
+              <w:rPr>
+                <w:color w:val="000000" w:themeColor="text1"/>
+                <w:sz w:val="20"/>
+                <w:szCs w:val="20"/>
+              </w:rPr>
+            </w:pPr>
+            <w:r>
+              <w:rPr>
+                <w:color w:val="000000" w:themeColor="text1"/>
+                <w:sz w:val="20"/>
+                <w:szCs w:val="20"/>
+              </w:rPr>
+              <w:t>N</w:t>
+            </w:r>
+            <w:r>
+              <w:rPr>
+                <w:color w:val="000000" w:themeColor="text1"/>
+                <w:sz w:val="20"/>
+                <w:szCs w:val="20"/>
+              </w:rPr>
+              <w:t>ão houver oleosidade, graxas, óxidos, carepas, borras de solda ou material livre no interior</w:t>
+            </w:r>
+            <w:r>
+              <w:rPr>
+                <w:color w:val="000000" w:themeColor="text1"/>
+                <w:sz w:val="20"/>
+                <w:szCs w:val="20"/>
+              </w:rPr>
+              <w:t>;</w:t>
+            </w:r>
+          </w:p>
+          <w:p>
+            <w:pPr>
+              <w:pStyle w:val="PargrafodaLista"/>
+              <w:widowControl w:val="0"/>
+              <w:numPr>
+                <w:ilvl w:val="0"/>
+                <w:numId w:val="1"/>
+              </w:numPr>
+              <w:spacing w:line="240" w:lineRule="auto"/>
+              <w:rPr>
+                <w:color w:val="000000" w:themeColor="text1"/>
+                <w:sz w:val="20"/>
+                <w:szCs w:val="20"/>
+              </w:rPr>
+            </w:pPr>
+            <w:r>
+              <w:rPr>
+                <w:color w:val="000000" w:themeColor="text1"/>
+                <w:sz w:val="20"/>
+                <w:szCs w:val="20"/>
+              </w:rPr>
+              <w:t>O</w:t>
+            </w:r>
+            <w:r>
+              <w:rPr>
+                <w:color w:val="000000" w:themeColor="text1"/>
+                <w:sz w:val="20"/>
+                <w:szCs w:val="20"/>
+              </w:rPr>
+              <w:t xml:space="preserve"> </w:t>
+            </w:r>
+            <w:proofErr w:type="spellStart"/>
+            <w:r>
+              <w:rPr>
+                <w:color w:val="000000" w:themeColor="text1"/>
+                <w:sz w:val="20"/>
+                <w:szCs w:val="20"/>
+              </w:rPr>
+              <w:t>spool</w:t>
+            </w:r>
+            <w:proofErr w:type="spellEnd"/>
+            <w:r>
+              <w:rPr>
+                <w:color w:val="000000" w:themeColor="text1"/>
+                <w:sz w:val="20"/>
+                <w:szCs w:val="20"/>
+              </w:rPr>
+              <w:t xml:space="preserve"> apresentar aspecto interno em tom cinza claro/escuro, conforme a metalurgia;</w:t>
+            </w:r>
+          </w:p>
+          <w:p>
+            <w:pPr>
+              <w:pStyle w:val="PargrafodaLista"/>
+              <w:widowControl w:val="0"/>
+              <w:numPr>
+                <w:ilvl w:val="0"/>
+                <w:numId w:val="1"/>
+              </w:numPr>
+              <w:spacing w:line="240" w:lineRule="auto"/>
+              <w:rPr>
+                <w:color w:val="000000" w:themeColor="text1"/>
+                <w:sz w:val="20"/>
+                <w:szCs w:val="20"/>
+              </w:rPr>
+            </w:pPr>
+            <w:r>
+              <w:rPr>
+                <w:color w:val="000000" w:themeColor="text1"/>
+                <w:sz w:val="20"/>
+                <w:szCs w:val="20"/>
+              </w:rPr>
+              <w:t>A</w:t>
+            </w:r>
+            <w:r>
+              <w:rPr>
+                <w:color w:val="000000" w:themeColor="text1"/>
+                <w:sz w:val="20"/>
+                <w:szCs w:val="20"/>
+              </w:rPr>
+              <w:t>s etapas de desengraxe, fase ácida, neutralização e passivação tiverem sido executadas</w:t>
+            </w:r>
+            <w:r>
+              <w:rPr>
+                <w:color w:val="000000" w:themeColor="text1"/>
+                <w:sz w:val="20"/>
+                <w:szCs w:val="20"/>
+              </w:rPr>
+              <w:t xml:space="preserve"> (conforme a necessidade avaliada)</w:t>
+            </w:r>
+            <w:r>
+              <w:rPr>
+                <w:color w:val="000000" w:themeColor="text1"/>
+                <w:sz w:val="20"/>
+                <w:szCs w:val="20"/>
+              </w:rPr>
+              <w:t>;</w:t>
+            </w:r>
+          </w:p>
+          <w:p>
+            <w:pPr>
+              <w:pStyle w:val="PargrafodaLista"/>
+              <w:widowControl w:val="0"/>
+              <w:numPr>
+                <w:ilvl w:val="0"/>
+                <w:numId w:val="1"/>
+              </w:numPr>
+              <w:spacing w:line="240" w:lineRule="auto"/>
+              <w:rPr>
+                <w:color w:val="000000" w:themeColor="text1"/>
+                <w:sz w:val="18"/>
+                <w:szCs w:val="18"/>
+              </w:rPr>
+            </w:pPr>
+            <w:r>
+              <w:rPr>
+                <w:color w:val="000000" w:themeColor="text1"/>
+                <w:sz w:val="20"/>
+                <w:szCs w:val="20"/>
+              </w:rPr>
+              <w:t>A</w:t>
+            </w:r>
+            <w:r>
+              <w:rPr>
+                <w:color w:val="000000" w:themeColor="text1"/>
+                <w:sz w:val="20"/>
+                <w:szCs w:val="20"/>
+              </w:rPr>
+              <w:t>s extremidades forem seladas após a inspeção final para evitar recontaminação</w:t>
+            </w:r>
+          </w:p>
+        </w:tc>
+      </w:tr>
+    </w:tbl>
+    <w:p/>
     <w:p/>
     <w:tbl>
       <w:tblPr>
@@ -1816,6 +2161,7 @@
                 <w:b/>
                 <w:bCs/>
               </w:rPr>
+              <w:lastRenderedPageBreak/>
               <w:t xml:space="preserve">       ASSINATURAS</w:t>
             </w:r>
           </w:p>
@@ -2018,12 +2364,12 @@
       </w:pPr>
     </w:p>
     <w:sectPr>
-      <w:headerReference w:type="even" r:id="rId6"/>
-      <w:headerReference w:type="default" r:id="rId7"/>
-      <w:footerReference w:type="even" r:id="rId8"/>
-      <w:footerReference w:type="default" r:id="rId9"/>
-      <w:headerReference w:type="first" r:id="rId10"/>
-      <w:footerReference w:type="first" r:id="rId11"/>
+      <w:headerReference w:type="even" r:id="rId7"/>
+      <w:headerReference w:type="default" r:id="rId8"/>
+      <w:footerReference w:type="even" r:id="rId9"/>
+      <w:footerReference w:type="default" r:id="rId10"/>
+      <w:headerReference w:type="first" r:id="rId11"/>
+      <w:footerReference w:type="first" r:id="rId12"/>
       <w:pgSz w:w="11909" w:h="16834"/>
       <w:pgMar w:top="1440" w:right="1440" w:bottom="1440" w:left="1440" w:header="720" w:footer="453" w:gutter="0"/>
       <w:pgNumType w:start="1"/>
@@ -2989,6 +3335,100 @@
 </w:hdr>
 </file>
 
+<file path=word/numbering.xml><?xml version="1.0" encoding="utf-8"?>
+<w:numbering xmlns:wpc="http://schemas.microsoft.com/office/word/2010/wordprocessingCanvas" xmlns:cx="http://schemas.microsoft.com/office/drawing/2014/chartex" xmlns:cx1="http://schemas.microsoft.com/office/drawing/2015/9/8/chartex" xmlns:cx2="http://schemas.microsoft.com/office/drawing/2015/10/21/chartex" xmlns:cx3="http://schemas.microsoft.com/office/drawing/2016/5/9/chartex" xmlns:cx4="http://schemas.microsoft.com/office/drawing/2016/5/10/chartex" xmlns:cx5="http://schemas.microsoft.com/office/drawing/2016/5/11/chartex" xmlns:cx6="http://schemas.microsoft.com/office/drawing/2016/5/12/chartex" xmlns:cx7="http://schemas.microsoft.com/office/drawing/2016/5/13/chartex" xmlns:cx8="http://schemas.microsoft.com/office/drawing/2016/5/14/chartex" xmlns:mc="http://schemas.openxmlformats.org/markup-compatibility/2006" xmlns:aink="http://schemas.microsoft.com/office/drawing/2016/ink" xmlns:am3d="http://schemas.microsoft.com/office/drawing/2017/model3d" xmlns:o="urn:schemas-microsoft-com:office:office" xmlns:oel="http://schemas.microsoft.com/office/2019/extlst" xmlns:r="http://schemas.openxmlformats.org/officeDocument/2006/relationships" xmlns:m="http://schemas.openxmlformats.org/officeDocument/2006/math" xmlns:v="urn:schemas-microsoft-com:vml" xmlns:wp14="http://schemas.microsoft.com/office/word/2010/wordprocessingDrawing" xmlns:wp="http://schemas.openxmlformats.org/drawingml/2006/wordprocessingDrawing" xmlns:w10="urn:schemas-microsoft-com:office:word" xmlns:w="http://schemas.openxmlformats.org/wordprocessingml/2006/main" xmlns:w14="http://schemas.microsoft.com/office/word/2010/wordml" xmlns:w15="http://schemas.microsoft.com/office/word/2012/wordml" xmlns:w16cex="http://schemas.microsoft.com/office/word/2018/wordml/cex" xmlns:w16cid="http://schemas.microsoft.com/office/word/2016/wordml/cid" xmlns:w16="http://schemas.microsoft.com/office/word/2018/wordml" xmlns:w16du="http://schemas.microsoft.com/office/word/2023/wordml/word16du" xmlns:w16sdtdh="http://schemas.microsoft.com/office/word/2020/wordml/sdtdatahash" xmlns:w16sdtfl="http://schemas.microsoft.com/office/word/2024/wordml/sdtformatlock" xmlns:w16se="http://schemas.microsoft.com/office/word/2015/wordml/symex" xmlns:wpg="http://schemas.microsoft.com/office/word/2010/wordprocessingGroup" xmlns:wpi="http://schemas.microsoft.com/office/word/2010/wordprocessingInk" xmlns:wne="http://schemas.microsoft.com/office/word/2006/wordml" xmlns:wps="http://schemas.microsoft.com/office/word/2010/wordprocessingShape" mc:Ignorable="w14 w15 w16se w16cid w16 w16cex w16sdtdh w16sdtfl w16du wp14">
+  <w:abstractNum w:abstractNumId="0" w15:restartNumberingAfterBreak="0">
+    <w:nsid w:val="62092DF7"/>
+    <w:multiLevelType w:val="hybridMultilevel"/>
+    <w:tmpl w:val="2422A6E4"/>
+    <w:lvl w:ilvl="0" w:tplc="0416000F">
+      <w:start w:val="1"/>
+      <w:numFmt w:val="decimal"/>
+      <w:lvlText w:val="%1."/>
+      <w:lvlJc w:val="left"/>
+      <w:pPr>
+        <w:ind w:left="720" w:hanging="360"/>
+      </w:pPr>
+    </w:lvl>
+    <w:lvl w:ilvl="1" w:tplc="04160019" w:tentative="1">
+      <w:start w:val="1"/>
+      <w:numFmt w:val="lowerLetter"/>
+      <w:lvlText w:val="%2."/>
+      <w:lvlJc w:val="left"/>
+      <w:pPr>
+        <w:ind w:left="1440" w:hanging="360"/>
+      </w:pPr>
+    </w:lvl>
+    <w:lvl w:ilvl="2" w:tplc="0416001B" w:tentative="1">
+      <w:start w:val="1"/>
+      <w:numFmt w:val="lowerRoman"/>
+      <w:lvlText w:val="%3."/>
+      <w:lvlJc w:val="right"/>
+      <w:pPr>
+        <w:ind w:left="2160" w:hanging="180"/>
+      </w:pPr>
+    </w:lvl>
+    <w:lvl w:ilvl="3" w:tplc="0416000F" w:tentative="1">
+      <w:start w:val="1"/>
+      <w:numFmt w:val="decimal"/>
+      <w:lvlText w:val="%4."/>
+      <w:lvlJc w:val="left"/>
+      <w:pPr>
+        <w:ind w:left="2880" w:hanging="360"/>
+      </w:pPr>
+    </w:lvl>
+    <w:lvl w:ilvl="4" w:tplc="04160019" w:tentative="1">
+      <w:start w:val="1"/>
+      <w:numFmt w:val="lowerLetter"/>
+      <w:lvlText w:val="%5."/>
+      <w:lvlJc w:val="left"/>
+      <w:pPr>
+        <w:ind w:left="3600" w:hanging="360"/>
+      </w:pPr>
+    </w:lvl>
+    <w:lvl w:ilvl="5" w:tplc="0416001B" w:tentative="1">
+      <w:start w:val="1"/>
+      <w:numFmt w:val="lowerRoman"/>
+      <w:lvlText w:val="%6."/>
+      <w:lvlJc w:val="right"/>
+      <w:pPr>
+        <w:ind w:left="4320" w:hanging="180"/>
+      </w:pPr>
+    </w:lvl>
+    <w:lvl w:ilvl="6" w:tplc="0416000F" w:tentative="1">
+      <w:start w:val="1"/>
+      <w:numFmt w:val="decimal"/>
+      <w:lvlText w:val="%7."/>
+      <w:lvlJc w:val="left"/>
+      <w:pPr>
+        <w:ind w:left="5040" w:hanging="360"/>
+      </w:pPr>
+    </w:lvl>
+    <w:lvl w:ilvl="7" w:tplc="04160019" w:tentative="1">
+      <w:start w:val="1"/>
+      <w:numFmt w:val="lowerLetter"/>
+      <w:lvlText w:val="%8."/>
+      <w:lvlJc w:val="left"/>
+      <w:pPr>
+        <w:ind w:left="5760" w:hanging="360"/>
+      </w:pPr>
+    </w:lvl>
+    <w:lvl w:ilvl="8" w:tplc="0416001B" w:tentative="1">
+      <w:start w:val="1"/>
+      <w:numFmt w:val="lowerRoman"/>
+      <w:lvlText w:val="%9."/>
+      <w:lvlJc w:val="right"/>
+      <w:pPr>
+        <w:ind w:left="6480" w:hanging="180"/>
+      </w:pPr>
+    </w:lvl>
+  </w:abstractNum>
+  <w:num w:numId="1" w16cid:durableId="1127969548">
+    <w:abstractNumId w:val="0"/>
+  </w:num>
+</w:numbering>
+</file>
+
 <file path=word/styles.xml><?xml version="1.0" encoding="utf-8"?>
 <w:styles xmlns:mc="http://schemas.openxmlformats.org/markup-compatibility/2006" xmlns:r="http://schemas.openxmlformats.org/officeDocument/2006/relationships" xmlns:w="http://schemas.openxmlformats.org/wordprocessingml/2006/main" xmlns:w14="http://schemas.microsoft.com/office/word/2010/wordml" xmlns:w15="http://schemas.microsoft.com/office/word/2012/wordml" xmlns:w16cex="http://schemas.microsoft.com/office/word/2018/wordml/cex" xmlns:w16cid="http://schemas.microsoft.com/office/word/2016/wordml/cid" xmlns:w16="http://schemas.microsoft.com/office/word/2018/wordml" xmlns:w16du="http://schemas.microsoft.com/office/word/2023/wordml/word16du" xmlns:w16sdtdh="http://schemas.microsoft.com/office/word/2020/wordml/sdtdatahash" xmlns:w16sdtfl="http://schemas.microsoft.com/office/word/2024/wordml/sdtformatlock" xmlns:w16se="http://schemas.microsoft.com/office/word/2015/wordml/symex" mc:Ignorable="w14 w15 w16se w16cid w16 w16cex w16sdtdh w16sdtfl w16du">
   <w:docDefaults>
@@ -3387,7 +3827,7 @@
   <w:style w:type="paragraph" w:default="1" w:styleId="Normal">
     <w:name w:val="Normal"/>
     <w:qFormat/>
-    <w:rsid w:val="001171DA"/>
+    <w:rsid w:val="007B58FE"/>
   </w:style>
   <w:style w:type="paragraph" w:styleId="Ttulo1">
     <w:name w:val="heading 1"/>
@@ -3506,7 +3946,6 @@
   <w:style w:type="character" w:default="1" w:styleId="Fontepargpadro">
     <w:name w:val="Default Paragraph Font"/>
     <w:uiPriority w:val="1"/>
-    <w:semiHidden/>
     <w:unhideWhenUsed/>
   </w:style>
   <w:style w:type="table" w:default="1" w:styleId="Tabelanormal">
@@ -3694,6 +4133,17 @@
         <w:insideV w:val="single" w:sz="4" w:space="0" w:color="auto"/>
       </w:tblBorders>
     </w:tblPr>
+  </w:style>
+  <w:style w:type="paragraph" w:styleId="PargrafodaLista">
+    <w:name w:val="List Paragraph"/>
+    <w:basedOn w:val="Normal"/>
+    <w:uiPriority w:val="34"/>
+    <w:qFormat/>
+    <w:rsid w:val="007B58FE"/>
+    <w:pPr>
+      <w:ind w:left="720"/>
+      <w:contextualSpacing/>
+    </w:pPr>
   </w:style>
 </w:styles>
 </file>

</xml_diff>